<commit_message>
Release v1.0.2 UI redesign and desktop fixes
Redesign dashboard and project workspace, restore OTA updates, and fix export and workflow bugs from field testing.
</commit_message>
<xml_diff>
--- a/templates/Bulk Sample Template.docx
+++ b/templates/Bulk Sample Template.docx
@@ -5,13 +5,14 @@
     <w:tbl>
       <w:tblPr>
         <w:tblStyle w:val="TableGrid"/>
-        <w:tblW w:w="10417" w:type="dxa"/>
+        <w:tblW w:w="0" w:type="auto"/>
         <w:tblInd w:w="-522" w:type="dxa"/>
+        <w:tblLayout w:type="fixed"/>
         <w:tblLook w:val="0420" w:firstRow="1" w:lastRow="0" w:firstColumn="0" w:lastColumn="0" w:noHBand="0" w:noVBand="1"/>
       </w:tblPr>
       <w:tblGrid>
-        <w:gridCol w:w="3396"/>
-        <w:gridCol w:w="7021"/>
+        <w:gridCol w:w="2497"/>
+        <w:gridCol w:w="8190"/>
       </w:tblGrid>
       <w:tr>
         <w:trPr>
@@ -20,7 +21,7 @@
         </w:trPr>
         <w:tc>
           <w:tcPr>
-            <w:tcW w:w="3037" w:type="dxa"/>
+            <w:tcW w:w="2497" w:type="dxa"/>
             <w:shd w:val="clear" w:color="auto" w:fill="D9D9D9" w:themeFill="background1" w:themeFillShade="D9"/>
             <w:vAlign w:val="center"/>
           </w:tcPr>
@@ -43,7 +44,7 @@
         </w:tc>
         <w:tc>
           <w:tcPr>
-            <w:tcW w:w="7380" w:type="dxa"/>
+            <w:tcW w:w="8190" w:type="dxa"/>
             <w:shd w:val="clear" w:color="auto" w:fill="D9D9D9" w:themeFill="background1" w:themeFillShade="D9"/>
             <w:vAlign w:val="center"/>
           </w:tcPr>
@@ -72,7 +73,7 @@
         </w:trPr>
         <w:tc>
           <w:tcPr>
-            <w:tcW w:w="3037" w:type="dxa"/>
+            <w:tcW w:w="2497" w:type="dxa"/>
             <w:vAlign w:val="center"/>
           </w:tcPr>
           <w:p>
@@ -96,14 +97,7 @@
                 <w:rFonts w:ascii="Arial" w:hAnsi="Arial" w:cs="Arial"/>
                 <w:bCs/>
               </w:rPr>
-              <w:t>samplesBulk}</w:t>
-            </w:r>
-            <w:r>
-              <w:rPr>
-                <w:rFonts w:ascii="Arial" w:hAnsi="Arial" w:cs="Arial"/>
-                <w:bCs/>
-              </w:rPr>
-              <w:t>{</w:t>
+              <w:t>samplesBulk}{</w:t>
             </w:r>
             <w:proofErr w:type="gramEnd"/>
             <w:r>
@@ -111,20 +105,13 @@
                 <w:rFonts w:ascii="Arial" w:hAnsi="Arial" w:cs="Arial"/>
                 <w:bCs/>
               </w:rPr>
-              <w:t>projectNumber}-</w:t>
-            </w:r>
-            <w:r>
-              <w:rPr>
-                <w:rFonts w:ascii="Arial" w:hAnsi="Arial" w:cs="Arial"/>
-                <w:bCs/>
-              </w:rPr>
-              <w:t>{sampleID}</w:t>
+              <w:t>projectNumber}-{sampleID}</w:t>
             </w:r>
           </w:p>
         </w:tc>
         <w:tc>
           <w:tcPr>
-            <w:tcW w:w="7380" w:type="dxa"/>
+            <w:tcW w:w="8190" w:type="dxa"/>
             <w:vAlign w:val="center"/>
           </w:tcPr>
           <w:p>
@@ -173,21 +160,7 @@
                 <w:rFonts w:ascii="Arial" w:hAnsi="Arial" w:cs="Arial"/>
                 <w:bCs/>
               </w:rPr>
-              <w:t>sample</w:t>
-            </w:r>
-            <w:r>
-              <w:rPr>
-                <w:rFonts w:ascii="Arial" w:hAnsi="Arial" w:cs="Arial"/>
-                <w:bCs/>
-              </w:rPr>
-              <w:t>s</w:t>
-            </w:r>
-            <w:r>
-              <w:rPr>
-                <w:rFonts w:ascii="Arial" w:hAnsi="Arial" w:cs="Arial"/>
-                <w:bCs/>
-              </w:rPr>
-              <w:t>Bulk</w:t>
+              <w:t>samplesBulk</w:t>
             </w:r>
             <w:proofErr w:type="spellEnd"/>
             <w:r>
@@ -208,18 +181,11 @@
         </w:rPr>
       </w:pPr>
     </w:p>
-    <w:p>
-      <w:pPr>
-        <w:rPr>
-          <w:rFonts w:ascii="Arial" w:hAnsi="Arial" w:cs="Arial"/>
-        </w:rPr>
-      </w:pPr>
-    </w:p>
     <w:sectPr>
       <w:headerReference w:type="default" r:id="rId7"/>
       <w:footerReference w:type="default" r:id="rId8"/>
       <w:pgSz w:w="12240" w:h="15840"/>
-      <w:pgMar w:top="2246" w:right="720" w:bottom="720" w:left="720" w:header="274" w:footer="432" w:gutter="1008"/>
+      <w:pgMar w:top="2246" w:right="720" w:bottom="720" w:left="288" w:header="274" w:footer="432" w:gutter="1008"/>
       <w:cols w:space="720"/>
       <w:docGrid w:linePitch="360"/>
     </w:sectPr>
@@ -608,13 +574,13 @@
         <w:szCs w:val="36"/>
       </w:rPr>
       <w:drawing>
-        <wp:anchor distT="0" distB="0" distL="114300" distR="114300" simplePos="0" relativeHeight="251662336" behindDoc="1" locked="0" layoutInCell="1" allowOverlap="1" wp14:anchorId="32102399" wp14:editId="13FE4072">
+        <wp:anchor distT="0" distB="0" distL="114300" distR="114300" simplePos="0" relativeHeight="251662336" behindDoc="1" locked="0" layoutInCell="1" allowOverlap="1" wp14:anchorId="32102399" wp14:editId="62BD98CD">
           <wp:simplePos x="0" y="0"/>
           <wp:positionH relativeFrom="column">
-            <wp:posOffset>-629285</wp:posOffset>
+            <wp:posOffset>-178022</wp:posOffset>
           </wp:positionH>
-          <wp:positionV relativeFrom="paragraph">
-            <wp:posOffset>14605</wp:posOffset>
+          <wp:positionV relativeFrom="page">
+            <wp:posOffset>187960</wp:posOffset>
           </wp:positionV>
           <wp:extent cx="1522730" cy="445770"/>
           <wp:effectExtent l="0" t="0" r="1270" b="0"/>
@@ -627,7 +593,7 @@
               <wp:lineTo x="0" y="0"/>
             </wp:wrapPolygon>
           </wp:wrapTight>
-          <wp:docPr id="1287920465" name="Picture 4" descr="A picture containing text, font, white, design&#10;&#10;Description automatically generated"/>
+          <wp:docPr id="2089727041" name="Picture 4" descr="A picture containing text, font, white, design&#10;&#10;Description automatically generated"/>
           <wp:cNvGraphicFramePr>
             <a:graphicFrameLocks xmlns:a="http://schemas.openxmlformats.org/drawingml/2006/main" noChangeAspect="1"/>
           </wp:cNvGraphicFramePr>
@@ -670,15 +636,6 @@
           </wp14:sizeRelV>
         </wp:anchor>
       </w:drawing>
-    </w:r>
-    <w:r>
-      <w:rPr>
-        <w:rFonts w:ascii="Arial" w:hAnsi="Arial" w:cs="Arial"/>
-        <w:b/>
-        <w:sz w:val="36"/>
-        <w:szCs w:val="36"/>
-      </w:rPr>
-      <w:t xml:space="preserve">          </w:t>
     </w:r>
     <w:r>
       <w:rPr>

</xml_diff>